<commit_message>
Resume and Website Update
</commit_message>
<xml_diff>
--- a/docs/Moulton - Original Resume.docx
+++ b/docs/Moulton - Original Resume.docx
@@ -31,6 +31,7 @@
         <w:ind w:left="3137" w:right="2968"/>
         <w:jc w:val="center"/>
         <w:rPr>
+          <w:w w:val="95"/>
           <w:sz w:val="23"/>
         </w:rPr>
       </w:pPr>
@@ -140,6 +141,54 @@
       <w:r>
         <w:rPr>
           <w:spacing w:val="4"/>
+          <w:w w:val="95"/>
+          <w:sz w:val="23"/>
+        </w:rPr>
+        <w:t xml:space="preserve"> </w:t>
+      </w:r>
+      <w:r>
+        <w:rPr>
+          <w:rFonts w:ascii="Arial MT" w:hAnsi="Arial MT"/>
+          <w:w w:val="95"/>
+          <w:sz w:val="14"/>
+        </w:rPr>
+        <w:t>●</w:t>
+      </w:r>
+      <w:r>
+        <w:rPr>
+          <w:rFonts w:ascii="Arial MT" w:hAnsi="Arial MT"/>
+          <w:w w:val="95"/>
+          <w:sz w:val="14"/>
+        </w:rPr>
+        <w:t xml:space="preserve"> </w:t>
+      </w:r>
+      <w:r>
+        <w:rPr>
+          <w:w w:val="95"/>
+          <w:sz w:val="23"/>
+        </w:rPr>
+        <w:t>Portfolio</w:t>
+      </w:r>
+      <w:r>
+        <w:rPr>
+          <w:rFonts w:ascii="Arial MT" w:hAnsi="Arial MT"/>
+          <w:w w:val="95"/>
+          <w:sz w:val="14"/>
+        </w:rPr>
+        <w:t xml:space="preserve">: </w:t>
+      </w:r>
+      <w:hyperlink r:id="rId7" w:history="1">
+        <w:r>
+          <w:rPr>
+            <w:rStyle w:val="Hyperlink"/>
+            <w:w w:val="95"/>
+            <w:sz w:val="23"/>
+          </w:rPr>
+          <w:t>https://tmoulton-cyber.github.io/</w:t>
+        </w:r>
+      </w:hyperlink>
+      <w:r>
+        <w:rPr>
           <w:w w:val="95"/>
           <w:sz w:val="23"/>
         </w:rPr>
@@ -4054,6 +4103,7 @@
   <w:style w:type="character" w:default="1" w:styleId="DefaultParagraphFont">
     <w:name w:val="Default Paragraph Font"/>
     <w:uiPriority w:val="1"/>
+    <w:semiHidden/>
     <w:unhideWhenUsed/>
   </w:style>
   <w:style w:type="table" w:default="1" w:styleId="TableNormal">

</xml_diff>